<commit_message>
Actualiza documentacion del proyecto
</commit_message>
<xml_diff>
--- a/Documentacion/Evidencias proyecto/Product Vision/Product_Vision_APT.docx
+++ b/Documentacion/Evidencias proyecto/Product Vision/Product_Vision_APT.docx
@@ -5,7 +5,7 @@
     <w:p>
       <w:pPr>
         <w:spacing w:after="0" w:lineRule="auto"/>
-        <w:jc w:val="center"/>
+        <w:jc w:val="both"/>
         <w:rPr>
           <w:rFonts w:ascii="Arial" w:cs="Arial" w:eastAsia="Arial" w:hAnsi="Arial"/>
         </w:rPr>
@@ -31,7 +31,7 @@
     <w:p>
       <w:pPr>
         <w:spacing w:after="20" w:before="0" w:lineRule="auto"/>
-        <w:jc w:val="center"/>
+        <w:jc w:val="both"/>
         <w:rPr>
           <w:rFonts w:ascii="Arial" w:cs="Arial" w:eastAsia="Arial" w:hAnsi="Arial"/>
         </w:rPr>
@@ -57,7 +57,7 @@
     <w:p>
       <w:pPr>
         <w:spacing w:after="140" w:before="0" w:lineRule="auto"/>
-        <w:jc w:val="center"/>
+        <w:jc w:val="both"/>
         <w:rPr>
           <w:rFonts w:ascii="Arial" w:cs="Arial" w:eastAsia="Arial" w:hAnsi="Arial"/>
         </w:rPr>
@@ -123,6 +123,7 @@
           <w:p>
             <w:pPr>
               <w:spacing w:after="0" w:lineRule="auto"/>
+              <w:jc w:val="both"/>
               <w:rPr>
                 <w:rFonts w:ascii="Arial" w:cs="Arial" w:eastAsia="Arial" w:hAnsi="Arial"/>
               </w:rPr>
@@ -163,6 +164,7 @@
           <w:p>
             <w:pPr>
               <w:spacing w:after="0" w:lineRule="auto"/>
+              <w:jc w:val="both"/>
               <w:rPr>
                 <w:rFonts w:ascii="Arial" w:cs="Arial" w:eastAsia="Arial" w:hAnsi="Arial"/>
               </w:rPr>
@@ -201,6 +203,7 @@
           <w:p>
             <w:pPr>
               <w:spacing w:after="0" w:lineRule="auto"/>
+              <w:jc w:val="both"/>
               <w:rPr>
                 <w:rFonts w:ascii="Arial" w:cs="Arial" w:eastAsia="Arial" w:hAnsi="Arial"/>
               </w:rPr>
@@ -241,6 +244,7 @@
           <w:p>
             <w:pPr>
               <w:spacing w:after="0" w:lineRule="auto"/>
+              <w:jc w:val="both"/>
               <w:rPr>
                 <w:rFonts w:ascii="Arial" w:cs="Arial" w:eastAsia="Arial" w:hAnsi="Arial"/>
               </w:rPr>
@@ -285,6 +289,7 @@
           <w:p>
             <w:pPr>
               <w:spacing w:after="0" w:lineRule="auto"/>
+              <w:jc w:val="both"/>
               <w:rPr>
                 <w:rFonts w:ascii="Arial" w:cs="Arial" w:eastAsia="Arial" w:hAnsi="Arial"/>
               </w:rPr>
@@ -325,6 +330,7 @@
           <w:p>
             <w:pPr>
               <w:spacing w:after="0" w:lineRule="auto"/>
+              <w:jc w:val="both"/>
               <w:rPr>
                 <w:rFonts w:ascii="Arial" w:cs="Arial" w:eastAsia="Arial" w:hAnsi="Arial"/>
               </w:rPr>
@@ -363,6 +369,7 @@
           <w:p>
             <w:pPr>
               <w:spacing w:after="0" w:lineRule="auto"/>
+              <w:jc w:val="both"/>
               <w:rPr>
                 <w:rFonts w:ascii="Arial" w:cs="Arial" w:eastAsia="Arial" w:hAnsi="Arial"/>
               </w:rPr>
@@ -403,6 +410,7 @@
           <w:p>
             <w:pPr>
               <w:spacing w:after="0" w:lineRule="auto"/>
+              <w:jc w:val="both"/>
               <w:rPr>
                 <w:rFonts w:ascii="Arial" w:cs="Arial" w:eastAsia="Arial" w:hAnsi="Arial"/>
               </w:rPr>
@@ -447,6 +455,7 @@
           <w:p>
             <w:pPr>
               <w:spacing w:after="0" w:lineRule="auto"/>
+              <w:jc w:val="both"/>
               <w:rPr>
                 <w:rFonts w:ascii="Arial" w:cs="Arial" w:eastAsia="Arial" w:hAnsi="Arial"/>
               </w:rPr>
@@ -487,6 +496,7 @@
           <w:p>
             <w:pPr>
               <w:spacing w:after="0" w:lineRule="auto"/>
+              <w:jc w:val="both"/>
               <w:rPr>
                 <w:rFonts w:ascii="Arial" w:cs="Arial" w:eastAsia="Arial" w:hAnsi="Arial"/>
               </w:rPr>
@@ -525,6 +535,7 @@
           <w:p>
             <w:pPr>
               <w:spacing w:after="0" w:lineRule="auto"/>
+              <w:jc w:val="both"/>
               <w:rPr>
                 <w:rFonts w:ascii="Arial" w:cs="Arial" w:eastAsia="Arial" w:hAnsi="Arial"/>
               </w:rPr>
@@ -565,6 +576,7 @@
           <w:p>
             <w:pPr>
               <w:spacing w:after="0" w:lineRule="auto"/>
+              <w:jc w:val="both"/>
               <w:rPr>
                 <w:rFonts w:ascii="Arial" w:cs="Arial" w:eastAsia="Arial" w:hAnsi="Arial"/>
               </w:rPr>
@@ -576,7 +588,7 @@
                 <w:szCs w:val="15"/>
                 <w:rtl w:val="0"/>
               </w:rPr>
-              <w:t xml:space="preserve">Ivan Tamayo · Rodrigo Romero · Richard Diaz | Versión 1.0 · 30-08-2026</w:t>
+              <w:t xml:space="preserve">Iván Tamayo · Rodrigo Romero · Richard Díaz | Versión 1.1 · 30-08-2026</w:t>
             </w:r>
             <w:r>
               <w:rPr>
@@ -590,6 +602,7 @@
     <w:p>
       <w:pPr>
         <w:spacing w:after="40" w:before="100" w:lineRule="auto"/>
+        <w:jc w:val="both"/>
         <w:rPr>
           <w:rFonts w:ascii="Arial" w:cs="Arial" w:eastAsia="Arial" w:hAnsi="Arial"/>
         </w:rPr>
@@ -615,6 +628,7 @@
     <w:p>
       <w:pPr>
         <w:spacing w:after="40" w:line="252.00000000000003" w:lineRule="auto"/>
+        <w:jc w:val="both"/>
         <w:rPr>
           <w:rFonts w:ascii="Arial" w:cs="Arial" w:eastAsia="Arial" w:hAnsi="Arial"/>
         </w:rPr>
@@ -626,7 +640,7 @@
           <w:szCs w:val="17"/>
           <w:rtl w:val="0"/>
         </w:rPr>
-        <w:t xml:space="preserve">Establecer una visión compartida que oriente las decisiones del equipo, la priorización del Product Backlog y el desarrollo de los cinco Sprints, definiendo problema, usuarios, propuesta de valor, alcance del MVP, restricciones y criterios de éxito.</w:t>
+        <w:t xml:space="preserve">Establecer una visión compartida que oriente las decisiones del equipo, la priorización del Product Backlog y el desarrollo de los cinco Sprints, definiendo problema, usuarios, propuesta de valor, alcance del proyecto, restricciones y criterios de éxito.</w:t>
       </w:r>
       <w:r>
         <w:rPr>
@@ -672,6 +686,7 @@
           <w:p>
             <w:pPr>
               <w:spacing w:after="40" w:lineRule="auto"/>
+              <w:jc w:val="both"/>
               <w:rPr>
                 <w:rFonts w:ascii="Arial" w:cs="Arial" w:eastAsia="Arial" w:hAnsi="Arial"/>
               </w:rPr>
@@ -697,6 +712,7 @@
           <w:p>
             <w:pPr>
               <w:spacing w:after="0" w:lineRule="auto"/>
+              <w:jc w:val="both"/>
               <w:rPr>
                 <w:rFonts w:ascii="Arial" w:cs="Arial" w:eastAsia="Arial" w:hAnsi="Arial"/>
               </w:rPr>
@@ -722,6 +738,7 @@
     <w:p>
       <w:pPr>
         <w:spacing w:after="40" w:before="100" w:lineRule="auto"/>
+        <w:jc w:val="both"/>
         <w:rPr>
           <w:rFonts w:ascii="Arial" w:cs="Arial" w:eastAsia="Arial" w:hAnsi="Arial"/>
         </w:rPr>
@@ -747,6 +764,7 @@
     <w:p>
       <w:pPr>
         <w:spacing w:after="40" w:line="252.00000000000003" w:lineRule="auto"/>
+        <w:jc w:val="both"/>
         <w:rPr>
           <w:rFonts w:ascii="Arial" w:cs="Arial" w:eastAsia="Arial" w:hAnsi="Arial"/>
         </w:rPr>
@@ -769,6 +787,7 @@
     <w:p>
       <w:pPr>
         <w:spacing w:after="40" w:line="252.00000000000003" w:lineRule="auto"/>
+        <w:jc w:val="both"/>
         <w:rPr>
           <w:rFonts w:ascii="Arial" w:cs="Arial" w:eastAsia="Arial" w:hAnsi="Arial"/>
         </w:rPr>
@@ -791,6 +810,7 @@
     <w:p>
       <w:pPr>
         <w:spacing w:after="40" w:before="100" w:lineRule="auto"/>
+        <w:jc w:val="both"/>
         <w:rPr>
           <w:rFonts w:ascii="Arial" w:cs="Arial" w:eastAsia="Arial" w:hAnsi="Arial"/>
         </w:rPr>
@@ -844,7 +864,7 @@
           </w:tcPr>
           <w:p>
             <w:pPr>
-              <w:jc w:val="center"/>
+              <w:jc w:val="both"/>
               <w:rPr>
                 <w:rFonts w:ascii="Arial" w:cs="Arial" w:eastAsia="Arial" w:hAnsi="Arial"/>
               </w:rPr>
@@ -874,7 +894,7 @@
           </w:tcPr>
           <w:p>
             <w:pPr>
-              <w:jc w:val="center"/>
+              <w:jc w:val="both"/>
               <w:rPr>
                 <w:rFonts w:ascii="Arial" w:cs="Arial" w:eastAsia="Arial" w:hAnsi="Arial"/>
               </w:rPr>
@@ -904,7 +924,7 @@
           </w:tcPr>
           <w:p>
             <w:pPr>
-              <w:jc w:val="center"/>
+              <w:jc w:val="both"/>
               <w:rPr>
                 <w:rFonts w:ascii="Arial" w:cs="Arial" w:eastAsia="Arial" w:hAnsi="Arial"/>
               </w:rPr>
@@ -950,6 +970,7 @@
           </w:tcPr>
           <w:p>
             <w:pPr>
+              <w:jc w:val="both"/>
               <w:rPr>
                 <w:rFonts w:ascii="Arial" w:cs="Arial" w:eastAsia="Arial" w:hAnsi="Arial"/>
               </w:rPr>
@@ -986,6 +1007,7 @@
           </w:tcPr>
           <w:p>
             <w:pPr>
+              <w:jc w:val="both"/>
               <w:rPr>
                 <w:rFonts w:ascii="Arial" w:cs="Arial" w:eastAsia="Arial" w:hAnsi="Arial"/>
               </w:rPr>
@@ -1022,6 +1044,7 @@
           </w:tcPr>
           <w:p>
             <w:pPr>
+              <w:jc w:val="both"/>
               <w:rPr>
                 <w:rFonts w:ascii="Arial" w:cs="Arial" w:eastAsia="Arial" w:hAnsi="Arial"/>
               </w:rPr>
@@ -1064,6 +1087,7 @@
           </w:tcPr>
           <w:p>
             <w:pPr>
+              <w:jc w:val="both"/>
               <w:rPr>
                 <w:rFonts w:ascii="Arial" w:cs="Arial" w:eastAsia="Arial" w:hAnsi="Arial"/>
               </w:rPr>
@@ -1100,6 +1124,7 @@
           </w:tcPr>
           <w:p>
             <w:pPr>
+              <w:jc w:val="both"/>
               <w:rPr>
                 <w:rFonts w:ascii="Arial" w:cs="Arial" w:eastAsia="Arial" w:hAnsi="Arial"/>
               </w:rPr>
@@ -1136,6 +1161,7 @@
           </w:tcPr>
           <w:p>
             <w:pPr>
+              <w:jc w:val="both"/>
               <w:rPr>
                 <w:rFonts w:ascii="Arial" w:cs="Arial" w:eastAsia="Arial" w:hAnsi="Arial"/>
               </w:rPr>
@@ -1178,6 +1204,7 @@
           </w:tcPr>
           <w:p>
             <w:pPr>
+              <w:jc w:val="both"/>
               <w:rPr>
                 <w:rFonts w:ascii="Arial" w:cs="Arial" w:eastAsia="Arial" w:hAnsi="Arial"/>
               </w:rPr>
@@ -1214,6 +1241,7 @@
           </w:tcPr>
           <w:p>
             <w:pPr>
+              <w:jc w:val="both"/>
               <w:rPr>
                 <w:rFonts w:ascii="Arial" w:cs="Arial" w:eastAsia="Arial" w:hAnsi="Arial"/>
               </w:rPr>
@@ -1250,6 +1278,7 @@
           </w:tcPr>
           <w:p>
             <w:pPr>
+              <w:jc w:val="both"/>
               <w:rPr>
                 <w:rFonts w:ascii="Arial" w:cs="Arial" w:eastAsia="Arial" w:hAnsi="Arial"/>
               </w:rPr>
@@ -1292,6 +1321,7 @@
           </w:tcPr>
           <w:p>
             <w:pPr>
+              <w:jc w:val="both"/>
               <w:rPr>
                 <w:rFonts w:ascii="Arial" w:cs="Arial" w:eastAsia="Arial" w:hAnsi="Arial"/>
               </w:rPr>
@@ -1328,6 +1358,7 @@
           </w:tcPr>
           <w:p>
             <w:pPr>
+              <w:jc w:val="both"/>
               <w:rPr>
                 <w:rFonts w:ascii="Arial" w:cs="Arial" w:eastAsia="Arial" w:hAnsi="Arial"/>
               </w:rPr>
@@ -1364,6 +1395,7 @@
           </w:tcPr>
           <w:p>
             <w:pPr>
+              <w:jc w:val="both"/>
               <w:rPr>
                 <w:rFonts w:ascii="Arial" w:cs="Arial" w:eastAsia="Arial" w:hAnsi="Arial"/>
               </w:rPr>
@@ -1388,6 +1420,7 @@
     </w:tbl>
     <w:p>
       <w:pPr>
+        <w:jc w:val="both"/>
         <w:rPr>
           <w:rFonts w:ascii="Arial" w:cs="Arial" w:eastAsia="Arial" w:hAnsi="Arial"/>
         </w:rPr>
@@ -1403,6 +1436,7 @@
     <w:p>
       <w:pPr>
         <w:spacing w:after="40" w:before="100" w:lineRule="auto"/>
+        <w:jc w:val="both"/>
         <w:rPr>
           <w:rFonts w:ascii="Arial" w:cs="Arial" w:eastAsia="Arial" w:hAnsi="Arial"/>
         </w:rPr>
@@ -1417,7 +1451,7 @@
           <w:szCs w:val="22"/>
           <w:rtl w:val="0"/>
         </w:rPr>
-        <w:t xml:space="preserve">4. Alcance del MVP</w:t>
+        <w:t xml:space="preserve">4. Alcance del proyecto</w:t>
       </w:r>
       <w:r>
         <w:rPr>
@@ -1445,10 +1479,8 @@
         <w:shd w:fill="auto" w:val="clear"/>
         <w:spacing w:after="0" w:before="0" w:line="240" w:lineRule="auto"/>
         <w:ind w:left="360" w:right="0" w:hanging="360"/>
-        <w:jc w:val="left"/>
-        <w:rPr>
-          <w:rFonts w:ascii="Arial" w:cs="Arial" w:eastAsia="Arial" w:hAnsi="Arial"/>
-        </w:rPr>
+        <w:jc w:val="both"/>
+        <w:rPr/>
       </w:pPr>
       <w:r>
         <w:rPr>
@@ -1466,363 +1498,6 @@
           <w:rtl w:val="0"/>
         </w:rPr>
         <w:t xml:space="preserve">Acceso y usuarios: autenticación, registro, recuperación de contraseña, perfiles, roles y permisos.</w:t>
-      </w:r>
-    </w:p>
-    <w:p>
-      <w:pPr>
-        <w:keepNext w:val="0"/>
-        <w:keepLines w:val="0"/>
-        <w:pageBreakBefore w:val="0"/>
-        <w:widowControl w:val="1"/>
-        <w:numPr>
-          <w:ilvl w:val="0"/>
-          <w:numId w:val="1"/>
-        </w:numPr>
-        <w:pBdr>
-          <w:top w:space="0" w:sz="0" w:val="nil"/>
-          <w:left w:space="0" w:sz="0" w:val="nil"/>
-          <w:bottom w:space="0" w:sz="0" w:val="nil"/>
-          <w:right w:space="0" w:sz="0" w:val="nil"/>
-          <w:between w:space="0" w:sz="0" w:val="nil"/>
-        </w:pBdr>
-        <w:shd w:fill="auto" w:val="clear"/>
-        <w:spacing w:after="0" w:before="0" w:line="240" w:lineRule="auto"/>
-        <w:ind w:left="360" w:right="0" w:hanging="360"/>
-        <w:jc w:val="left"/>
-        <w:rPr>
-          <w:rFonts w:ascii="Arial" w:cs="Arial" w:eastAsia="Arial" w:hAnsi="Arial"/>
-        </w:rPr>
-      </w:pPr>
-      <w:r>
-        <w:rPr>
-          <w:rFonts w:ascii="Arial" w:cs="Arial" w:eastAsia="Arial" w:hAnsi="Arial"/>
-          <w:i w:val="0"/>
-          <w:iCs w:val="0"/>
-          <w:smallCaps w:val="0"/>
-          <w:strike w:val="0"/>
-          <w:color w:val="000000"/>
-          <w:sz w:val="17"/>
-          <w:szCs w:val="17"/>
-          <w:u w:val="none"/>
-          <w:shd w:fill="auto" w:val="clear"/>
-          <w:vertAlign w:val="baseline"/>
-          <w:rtl w:val="0"/>
-        </w:rPr>
-        <w:t xml:space="preserve">Organización: juntas de vecinos, sectores, directivas y cargos.</w:t>
-      </w:r>
-    </w:p>
-    <w:p>
-      <w:pPr>
-        <w:keepNext w:val="0"/>
-        <w:keepLines w:val="0"/>
-        <w:pageBreakBefore w:val="0"/>
-        <w:widowControl w:val="1"/>
-        <w:numPr>
-          <w:ilvl w:val="0"/>
-          <w:numId w:val="1"/>
-        </w:numPr>
-        <w:pBdr>
-          <w:top w:space="0" w:sz="0" w:val="nil"/>
-          <w:left w:space="0" w:sz="0" w:val="nil"/>
-          <w:bottom w:space="0" w:sz="0" w:val="nil"/>
-          <w:right w:space="0" w:sz="0" w:val="nil"/>
-          <w:between w:space="0" w:sz="0" w:val="nil"/>
-        </w:pBdr>
-        <w:shd w:fill="auto" w:val="clear"/>
-        <w:spacing w:after="0" w:before="0" w:line="240" w:lineRule="auto"/>
-        <w:ind w:left="360" w:right="0" w:hanging="360"/>
-        <w:jc w:val="left"/>
-        <w:rPr>
-          <w:rFonts w:ascii="Arial" w:cs="Arial" w:eastAsia="Arial" w:hAnsi="Arial"/>
-        </w:rPr>
-      </w:pPr>
-      <w:r>
-        <w:rPr>
-          <w:rFonts w:ascii="Arial" w:cs="Arial" w:eastAsia="Arial" w:hAnsi="Arial"/>
-          <w:i w:val="0"/>
-          <w:iCs w:val="0"/>
-          <w:smallCaps w:val="0"/>
-          <w:strike w:val="0"/>
-          <w:color w:val="000000"/>
-          <w:sz w:val="17"/>
-          <w:szCs w:val="17"/>
-          <w:u w:val="none"/>
-          <w:shd w:fill="auto" w:val="clear"/>
-          <w:vertAlign w:val="baseline"/>
-          <w:rtl w:val="0"/>
-        </w:rPr>
-        <w:t xml:space="preserve">Comunicación: publicaciones, adjuntos, notificaciones internas y mensajería Vecino-Directiva.</w:t>
-      </w:r>
-    </w:p>
-    <w:p>
-      <w:pPr>
-        <w:keepNext w:val="0"/>
-        <w:keepLines w:val="0"/>
-        <w:pageBreakBefore w:val="0"/>
-        <w:widowControl w:val="1"/>
-        <w:numPr>
-          <w:ilvl w:val="0"/>
-          <w:numId w:val="1"/>
-        </w:numPr>
-        <w:pBdr>
-          <w:top w:space="0" w:sz="0" w:val="nil"/>
-          <w:left w:space="0" w:sz="0" w:val="nil"/>
-          <w:bottom w:space="0" w:sz="0" w:val="nil"/>
-          <w:right w:space="0" w:sz="0" w:val="nil"/>
-          <w:between w:space="0" w:sz="0" w:val="nil"/>
-        </w:pBdr>
-        <w:shd w:fill="auto" w:val="clear"/>
-        <w:spacing w:after="0" w:before="0" w:line="240" w:lineRule="auto"/>
-        <w:ind w:left="360" w:right="0" w:hanging="360"/>
-        <w:jc w:val="left"/>
-        <w:rPr>
-          <w:rFonts w:ascii="Arial" w:cs="Arial" w:eastAsia="Arial" w:hAnsi="Arial"/>
-        </w:rPr>
-      </w:pPr>
-      <w:r>
-        <w:rPr>
-          <w:rFonts w:ascii="Arial" w:cs="Arial" w:eastAsia="Arial" w:hAnsi="Arial"/>
-          <w:i w:val="0"/>
-          <w:iCs w:val="0"/>
-          <w:smallCaps w:val="0"/>
-          <w:strike w:val="0"/>
-          <w:color w:val="000000"/>
-          <w:sz w:val="17"/>
-          <w:szCs w:val="17"/>
-          <w:u w:val="none"/>
-          <w:shd w:fill="auto" w:val="clear"/>
-          <w:vertAlign w:val="baseline"/>
-          <w:rtl w:val="0"/>
-        </w:rPr>
-        <w:t xml:space="preserve">Eventos: creación, consulta, inscripción y control básico de participantes/asistencia.</w:t>
-      </w:r>
-    </w:p>
-    <w:p>
-      <w:pPr>
-        <w:keepNext w:val="0"/>
-        <w:keepLines w:val="0"/>
-        <w:pageBreakBefore w:val="0"/>
-        <w:widowControl w:val="1"/>
-        <w:numPr>
-          <w:ilvl w:val="0"/>
-          <w:numId w:val="1"/>
-        </w:numPr>
-        <w:pBdr>
-          <w:top w:space="0" w:sz="0" w:val="nil"/>
-          <w:left w:space="0" w:sz="0" w:val="nil"/>
-          <w:bottom w:space="0" w:sz="0" w:val="nil"/>
-          <w:right w:space="0" w:sz="0" w:val="nil"/>
-          <w:between w:space="0" w:sz="0" w:val="nil"/>
-        </w:pBdr>
-        <w:shd w:fill="auto" w:val="clear"/>
-        <w:spacing w:after="0" w:before="0" w:line="240" w:lineRule="auto"/>
-        <w:ind w:left="360" w:right="0" w:hanging="360"/>
-        <w:jc w:val="left"/>
-        <w:rPr>
-          <w:rFonts w:ascii="Arial" w:cs="Arial" w:eastAsia="Arial" w:hAnsi="Arial"/>
-        </w:rPr>
-      </w:pPr>
-      <w:r>
-        <w:rPr>
-          <w:rFonts w:ascii="Arial" w:cs="Arial" w:eastAsia="Arial" w:hAnsi="Arial"/>
-          <w:i w:val="0"/>
-          <w:iCs w:val="0"/>
-          <w:smallCaps w:val="0"/>
-          <w:strike w:val="0"/>
-          <w:color w:val="000000"/>
-          <w:sz w:val="17"/>
-          <w:szCs w:val="17"/>
-          <w:u w:val="none"/>
-          <w:shd w:fill="auto" w:val="clear"/>
-          <w:vertAlign w:val="baseline"/>
-          <w:rtl w:val="0"/>
-        </w:rPr>
-        <w:t xml:space="preserve">Gestión vecinal: consultas, reclamos, solicitudes, documentos, estados, historial y seguimiento.</w:t>
-      </w:r>
-    </w:p>
-    <w:p>
-      <w:pPr>
-        <w:keepNext w:val="0"/>
-        <w:keepLines w:val="0"/>
-        <w:pageBreakBefore w:val="0"/>
-        <w:widowControl w:val="1"/>
-        <w:numPr>
-          <w:ilvl w:val="0"/>
-          <w:numId w:val="1"/>
-        </w:numPr>
-        <w:pBdr>
-          <w:top w:space="0" w:sz="0" w:val="nil"/>
-          <w:left w:space="0" w:sz="0" w:val="nil"/>
-          <w:bottom w:space="0" w:sz="0" w:val="nil"/>
-          <w:right w:space="0" w:sz="0" w:val="nil"/>
-          <w:between w:space="0" w:sz="0" w:val="nil"/>
-        </w:pBdr>
-        <w:shd w:fill="auto" w:val="clear"/>
-        <w:spacing w:after="0" w:before="0" w:line="240" w:lineRule="auto"/>
-        <w:ind w:left="360" w:right="0" w:hanging="360"/>
-        <w:jc w:val="left"/>
-        <w:rPr>
-          <w:rFonts w:ascii="Arial" w:cs="Arial" w:eastAsia="Arial" w:hAnsi="Arial"/>
-        </w:rPr>
-      </w:pPr>
-      <w:r>
-        <w:rPr>
-          <w:rFonts w:ascii="Arial" w:cs="Arial" w:eastAsia="Arial" w:hAnsi="Arial"/>
-          <w:i w:val="0"/>
-          <w:iCs w:val="0"/>
-          <w:smallCaps w:val="0"/>
-          <w:strike w:val="0"/>
-          <w:color w:val="000000"/>
-          <w:sz w:val="17"/>
-          <w:szCs w:val="17"/>
-          <w:u w:val="none"/>
-          <w:shd w:fill="auto" w:val="clear"/>
-          <w:vertAlign w:val="baseline"/>
-          <w:rtl w:val="0"/>
-        </w:rPr>
-        <w:t xml:space="preserve">Caracterización: fecha de nacimiento y sector, sin almacenar dirección exacta.</w:t>
-      </w:r>
-    </w:p>
-    <w:p>
-      <w:pPr>
-        <w:keepNext w:val="0"/>
-        <w:keepLines w:val="0"/>
-        <w:pageBreakBefore w:val="0"/>
-        <w:widowControl w:val="1"/>
-        <w:numPr>
-          <w:ilvl w:val="0"/>
-          <w:numId w:val="1"/>
-        </w:numPr>
-        <w:pBdr>
-          <w:top w:space="0" w:sz="0" w:val="nil"/>
-          <w:left w:space="0" w:sz="0" w:val="nil"/>
-          <w:bottom w:space="0" w:sz="0" w:val="nil"/>
-          <w:right w:space="0" w:sz="0" w:val="nil"/>
-          <w:between w:space="0" w:sz="0" w:val="nil"/>
-        </w:pBdr>
-        <w:shd w:fill="auto" w:val="clear"/>
-        <w:spacing w:after="0" w:before="0" w:line="240" w:lineRule="auto"/>
-        <w:ind w:left="360" w:right="0" w:hanging="360"/>
-        <w:jc w:val="left"/>
-        <w:rPr>
-          <w:rFonts w:ascii="Arial" w:cs="Arial" w:eastAsia="Arial" w:hAnsi="Arial"/>
-        </w:rPr>
-      </w:pPr>
-      <w:r>
-        <w:rPr>
-          <w:rFonts w:ascii="Arial" w:cs="Arial" w:eastAsia="Arial" w:hAnsi="Arial"/>
-          <w:i w:val="0"/>
-          <w:iCs w:val="0"/>
-          <w:smallCaps w:val="0"/>
-          <w:strike w:val="0"/>
-          <w:color w:val="000000"/>
-          <w:sz w:val="17"/>
-          <w:szCs w:val="17"/>
-          <w:u w:val="none"/>
-          <w:shd w:fill="auto" w:val="clear"/>
-          <w:vertAlign w:val="baseline"/>
-          <w:rtl w:val="0"/>
-        </w:rPr>
-        <w:t xml:space="preserve">Analítica: indicadores agregados, dashboard de Directiva, dashboard Municipal y filtros territoriales.</w:t>
-      </w:r>
-    </w:p>
-    <w:p>
-      <w:pPr>
-        <w:keepNext w:val="0"/>
-        <w:keepLines w:val="0"/>
-        <w:pageBreakBefore w:val="0"/>
-        <w:widowControl w:val="1"/>
-        <w:numPr>
-          <w:ilvl w:val="0"/>
-          <w:numId w:val="1"/>
-        </w:numPr>
-        <w:pBdr>
-          <w:top w:space="0" w:sz="0" w:val="nil"/>
-          <w:left w:space="0" w:sz="0" w:val="nil"/>
-          <w:bottom w:space="0" w:sz="0" w:val="nil"/>
-          <w:right w:space="0" w:sz="0" w:val="nil"/>
-          <w:between w:space="0" w:sz="0" w:val="nil"/>
-        </w:pBdr>
-        <w:shd w:fill="auto" w:val="clear"/>
-        <w:spacing w:after="20" w:before="0" w:line="240" w:lineRule="auto"/>
-        <w:ind w:left="360" w:right="0" w:hanging="360"/>
-        <w:jc w:val="left"/>
-        <w:rPr>
-          <w:rFonts w:ascii="Arial" w:cs="Arial" w:eastAsia="Arial" w:hAnsi="Arial"/>
-        </w:rPr>
-      </w:pPr>
-      <w:r>
-        <w:rPr>
-          <w:rFonts w:ascii="Arial" w:cs="Arial" w:eastAsia="Arial" w:hAnsi="Arial"/>
-          <w:i w:val="0"/>
-          <w:iCs w:val="0"/>
-          <w:smallCaps w:val="0"/>
-          <w:strike w:val="0"/>
-          <w:color w:val="000000"/>
-          <w:sz w:val="17"/>
-          <w:szCs w:val="17"/>
-          <w:u w:val="none"/>
-          <w:shd w:fill="auto" w:val="clear"/>
-          <w:vertAlign w:val="baseline"/>
-          <w:rtl w:val="0"/>
-        </w:rPr>
-        <w:t xml:space="preserve">IA: chatbot FAQ con Gemini API gratuita, sin acceso irrestricto a BD ni envío de datos sensibles.</w:t>
-      </w:r>
-    </w:p>
-    <w:p>
-      <w:pPr>
-        <w:spacing w:after="40" w:before="100" w:lineRule="auto"/>
-        <w:rPr>
-          <w:rFonts w:ascii="Arial" w:cs="Arial" w:eastAsia="Arial" w:hAnsi="Arial"/>
-          <w:b w:val="1"/>
-          <w:bCs w:val="1"/>
-          <w:color w:val="1f4e78"/>
-          <w:sz w:val="22"/>
-          <w:szCs w:val="22"/>
-        </w:rPr>
-      </w:pPr>
-      <w:r>
-        <w:rPr>
-          <w:rtl w:val="0"/>
-        </w:rPr>
-      </w:r>
-    </w:p>
-    <w:p>
-      <w:pPr>
-        <w:spacing w:after="40" w:before="100" w:lineRule="auto"/>
-        <w:rPr>
-          <w:rFonts w:ascii="Arial" w:cs="Arial" w:eastAsia="Arial" w:hAnsi="Arial"/>
-          <w:b w:val="1"/>
-          <w:bCs w:val="1"/>
-          <w:color w:val="1f4e78"/>
-          <w:sz w:val="22"/>
-          <w:szCs w:val="22"/>
-        </w:rPr>
-      </w:pPr>
-      <w:r>
-        <w:rPr>
-          <w:rtl w:val="0"/>
-        </w:rPr>
-      </w:r>
-    </w:p>
-    <w:p>
-      <w:pPr>
-        <w:spacing w:after="40" w:before="100" w:lineRule="auto"/>
-        <w:rPr>
-          <w:rFonts w:ascii="Arial" w:cs="Arial" w:eastAsia="Arial" w:hAnsi="Arial"/>
-        </w:rPr>
-      </w:pPr>
-      <w:r>
-        <w:rPr>
-          <w:rFonts w:ascii="Arial" w:cs="Arial" w:eastAsia="Arial" w:hAnsi="Arial"/>
-          <w:b w:val="1"/>
-          <w:bCs w:val="1"/>
-          <w:color w:val="1f4e78"/>
-          <w:sz w:val="22"/>
-          <w:szCs w:val="22"/>
-          <w:rtl w:val="0"/>
-        </w:rPr>
-        <w:t xml:space="preserve">5. Fuera del alcance del MVP</w:t>
       </w:r>
       <w:r>
         <w:rPr>
@@ -1850,10 +1525,394 @@
         <w:shd w:fill="auto" w:val="clear"/>
         <w:spacing w:after="0" w:before="0" w:line="240" w:lineRule="auto"/>
         <w:ind w:left="360" w:right="0" w:hanging="360"/>
-        <w:jc w:val="left"/>
+        <w:jc w:val="both"/>
+        <w:rPr/>
+      </w:pPr>
+      <w:r>
+        <w:rPr>
+          <w:rFonts w:ascii="Arial" w:cs="Arial" w:eastAsia="Arial" w:hAnsi="Arial"/>
+          <w:i w:val="0"/>
+          <w:iCs w:val="0"/>
+          <w:smallCaps w:val="0"/>
+          <w:strike w:val="0"/>
+          <w:color w:val="000000"/>
+          <w:sz w:val="17"/>
+          <w:szCs w:val="17"/>
+          <w:u w:val="none"/>
+          <w:shd w:fill="auto" w:val="clear"/>
+          <w:vertAlign w:val="baseline"/>
+          <w:rtl w:val="0"/>
+        </w:rPr>
+        <w:t xml:space="preserve">Organización: juntas de vecinos, sectores, directivas y cargos.</w:t>
+      </w:r>
+      <w:r>
+        <w:rPr>
+          <w:rtl w:val="0"/>
+        </w:rPr>
+      </w:r>
+    </w:p>
+    <w:p>
+      <w:pPr>
+        <w:keepNext w:val="0"/>
+        <w:keepLines w:val="0"/>
+        <w:pageBreakBefore w:val="0"/>
+        <w:widowControl w:val="1"/>
+        <w:numPr>
+          <w:ilvl w:val="0"/>
+          <w:numId w:val="1"/>
+        </w:numPr>
+        <w:pBdr>
+          <w:top w:space="0" w:sz="0" w:val="nil"/>
+          <w:left w:space="0" w:sz="0" w:val="nil"/>
+          <w:bottom w:space="0" w:sz="0" w:val="nil"/>
+          <w:right w:space="0" w:sz="0" w:val="nil"/>
+          <w:between w:space="0" w:sz="0" w:val="nil"/>
+        </w:pBdr>
+        <w:shd w:fill="auto" w:val="clear"/>
+        <w:spacing w:after="0" w:before="0" w:line="240" w:lineRule="auto"/>
+        <w:ind w:left="360" w:right="0" w:hanging="360"/>
+        <w:jc w:val="both"/>
+        <w:rPr/>
+      </w:pPr>
+      <w:r>
+        <w:rPr>
+          <w:rFonts w:ascii="Arial" w:cs="Arial" w:eastAsia="Arial" w:hAnsi="Arial"/>
+          <w:i w:val="0"/>
+          <w:iCs w:val="0"/>
+          <w:smallCaps w:val="0"/>
+          <w:strike w:val="0"/>
+          <w:color w:val="000000"/>
+          <w:sz w:val="17"/>
+          <w:szCs w:val="17"/>
+          <w:u w:val="none"/>
+          <w:shd w:fill="auto" w:val="clear"/>
+          <w:vertAlign w:val="baseline"/>
+          <w:rtl w:val="0"/>
+        </w:rPr>
+        <w:t xml:space="preserve">Comunicación: publicaciones, adjuntos, notificaciones internas y mensajería Vecino-Directiva.</w:t>
+      </w:r>
+      <w:r>
+        <w:rPr>
+          <w:rtl w:val="0"/>
+        </w:rPr>
+      </w:r>
+    </w:p>
+    <w:p>
+      <w:pPr>
+        <w:keepNext w:val="0"/>
+        <w:keepLines w:val="0"/>
+        <w:pageBreakBefore w:val="0"/>
+        <w:widowControl w:val="1"/>
+        <w:numPr>
+          <w:ilvl w:val="0"/>
+          <w:numId w:val="1"/>
+        </w:numPr>
+        <w:pBdr>
+          <w:top w:space="0" w:sz="0" w:val="nil"/>
+          <w:left w:space="0" w:sz="0" w:val="nil"/>
+          <w:bottom w:space="0" w:sz="0" w:val="nil"/>
+          <w:right w:space="0" w:sz="0" w:val="nil"/>
+          <w:between w:space="0" w:sz="0" w:val="nil"/>
+        </w:pBdr>
+        <w:shd w:fill="auto" w:val="clear"/>
+        <w:spacing w:after="0" w:before="0" w:line="240" w:lineRule="auto"/>
+        <w:ind w:left="360" w:right="0" w:hanging="360"/>
+        <w:jc w:val="both"/>
+        <w:rPr/>
+      </w:pPr>
+      <w:r>
+        <w:rPr>
+          <w:rFonts w:ascii="Arial" w:cs="Arial" w:eastAsia="Arial" w:hAnsi="Arial"/>
+          <w:i w:val="0"/>
+          <w:iCs w:val="0"/>
+          <w:smallCaps w:val="0"/>
+          <w:strike w:val="0"/>
+          <w:color w:val="000000"/>
+          <w:sz w:val="17"/>
+          <w:szCs w:val="17"/>
+          <w:u w:val="none"/>
+          <w:shd w:fill="auto" w:val="clear"/>
+          <w:vertAlign w:val="baseline"/>
+          <w:rtl w:val="0"/>
+        </w:rPr>
+        <w:t xml:space="preserve">Eventos: creación, consulta, inscripción y control básico de participantes/asistencia.</w:t>
+      </w:r>
+      <w:r>
+        <w:rPr>
+          <w:rtl w:val="0"/>
+        </w:rPr>
+      </w:r>
+    </w:p>
+    <w:p>
+      <w:pPr>
+        <w:keepNext w:val="0"/>
+        <w:keepLines w:val="0"/>
+        <w:pageBreakBefore w:val="0"/>
+        <w:widowControl w:val="1"/>
+        <w:numPr>
+          <w:ilvl w:val="0"/>
+          <w:numId w:val="1"/>
+        </w:numPr>
+        <w:pBdr>
+          <w:top w:space="0" w:sz="0" w:val="nil"/>
+          <w:left w:space="0" w:sz="0" w:val="nil"/>
+          <w:bottom w:space="0" w:sz="0" w:val="nil"/>
+          <w:right w:space="0" w:sz="0" w:val="nil"/>
+          <w:between w:space="0" w:sz="0" w:val="nil"/>
+        </w:pBdr>
+        <w:shd w:fill="auto" w:val="clear"/>
+        <w:spacing w:after="0" w:before="0" w:line="240" w:lineRule="auto"/>
+        <w:ind w:left="360" w:right="0" w:hanging="360"/>
+        <w:jc w:val="both"/>
+        <w:rPr/>
+      </w:pPr>
+      <w:r>
+        <w:rPr>
+          <w:rFonts w:ascii="Arial" w:cs="Arial" w:eastAsia="Arial" w:hAnsi="Arial"/>
+          <w:i w:val="0"/>
+          <w:iCs w:val="0"/>
+          <w:smallCaps w:val="0"/>
+          <w:strike w:val="0"/>
+          <w:color w:val="000000"/>
+          <w:sz w:val="17"/>
+          <w:szCs w:val="17"/>
+          <w:u w:val="none"/>
+          <w:shd w:fill="auto" w:val="clear"/>
+          <w:vertAlign w:val="baseline"/>
+          <w:rtl w:val="0"/>
+        </w:rPr>
+        <w:t xml:space="preserve">Gestión vecinal: consultas, reclamos, solicitudes, documentos, estados, historial y seguimiento.</w:t>
+      </w:r>
+      <w:r>
+        <w:rPr>
+          <w:rtl w:val="0"/>
+        </w:rPr>
+      </w:r>
+    </w:p>
+    <w:p>
+      <w:pPr>
+        <w:keepNext w:val="0"/>
+        <w:keepLines w:val="0"/>
+        <w:pageBreakBefore w:val="0"/>
+        <w:widowControl w:val="1"/>
+        <w:numPr>
+          <w:ilvl w:val="0"/>
+          <w:numId w:val="1"/>
+        </w:numPr>
+        <w:pBdr>
+          <w:top w:space="0" w:sz="0" w:val="nil"/>
+          <w:left w:space="0" w:sz="0" w:val="nil"/>
+          <w:bottom w:space="0" w:sz="0" w:val="nil"/>
+          <w:right w:space="0" w:sz="0" w:val="nil"/>
+          <w:between w:space="0" w:sz="0" w:val="nil"/>
+        </w:pBdr>
+        <w:shd w:fill="auto" w:val="clear"/>
+        <w:spacing w:after="0" w:before="0" w:line="240" w:lineRule="auto"/>
+        <w:ind w:left="360" w:right="0" w:hanging="360"/>
+        <w:jc w:val="both"/>
+        <w:rPr/>
+      </w:pPr>
+      <w:r>
+        <w:rPr>
+          <w:rFonts w:ascii="Arial" w:cs="Arial" w:eastAsia="Arial" w:hAnsi="Arial"/>
+          <w:i w:val="0"/>
+          <w:iCs w:val="0"/>
+          <w:smallCaps w:val="0"/>
+          <w:strike w:val="0"/>
+          <w:color w:val="000000"/>
+          <w:sz w:val="17"/>
+          <w:szCs w:val="17"/>
+          <w:u w:val="none"/>
+          <w:shd w:fill="auto" w:val="clear"/>
+          <w:vertAlign w:val="baseline"/>
+          <w:rtl w:val="0"/>
+        </w:rPr>
+        <w:t xml:space="preserve">Caracterización: fecha de nacimiento y sector, sin almacenar dirección exacta.</w:t>
+      </w:r>
+      <w:r>
+        <w:rPr>
+          <w:rtl w:val="0"/>
+        </w:rPr>
+      </w:r>
+    </w:p>
+    <w:p>
+      <w:pPr>
+        <w:keepNext w:val="0"/>
+        <w:keepLines w:val="0"/>
+        <w:pageBreakBefore w:val="0"/>
+        <w:widowControl w:val="1"/>
+        <w:numPr>
+          <w:ilvl w:val="0"/>
+          <w:numId w:val="1"/>
+        </w:numPr>
+        <w:pBdr>
+          <w:top w:space="0" w:sz="0" w:val="nil"/>
+          <w:left w:space="0" w:sz="0" w:val="nil"/>
+          <w:bottom w:space="0" w:sz="0" w:val="nil"/>
+          <w:right w:space="0" w:sz="0" w:val="nil"/>
+          <w:between w:space="0" w:sz="0" w:val="nil"/>
+        </w:pBdr>
+        <w:shd w:fill="auto" w:val="clear"/>
+        <w:spacing w:after="0" w:before="0" w:line="240" w:lineRule="auto"/>
+        <w:ind w:left="360" w:right="0" w:hanging="360"/>
+        <w:jc w:val="both"/>
+        <w:rPr/>
+      </w:pPr>
+      <w:r>
+        <w:rPr>
+          <w:rFonts w:ascii="Arial" w:cs="Arial" w:eastAsia="Arial" w:hAnsi="Arial"/>
+          <w:i w:val="0"/>
+          <w:iCs w:val="0"/>
+          <w:smallCaps w:val="0"/>
+          <w:strike w:val="0"/>
+          <w:color w:val="000000"/>
+          <w:sz w:val="17"/>
+          <w:szCs w:val="17"/>
+          <w:u w:val="none"/>
+          <w:shd w:fill="auto" w:val="clear"/>
+          <w:vertAlign w:val="baseline"/>
+          <w:rtl w:val="0"/>
+        </w:rPr>
+        <w:t xml:space="preserve">Analítica: indicadores agregados, dashboard de Directiva, dashboard Municipal y filtros territoriales.</w:t>
+      </w:r>
+      <w:r>
+        <w:rPr>
+          <w:rtl w:val="0"/>
+        </w:rPr>
+      </w:r>
+    </w:p>
+    <w:p>
+      <w:pPr>
+        <w:keepNext w:val="0"/>
+        <w:keepLines w:val="0"/>
+        <w:pageBreakBefore w:val="0"/>
+        <w:widowControl w:val="1"/>
+        <w:numPr>
+          <w:ilvl w:val="0"/>
+          <w:numId w:val="1"/>
+        </w:numPr>
+        <w:pBdr>
+          <w:top w:space="0" w:sz="0" w:val="nil"/>
+          <w:left w:space="0" w:sz="0" w:val="nil"/>
+          <w:bottom w:space="0" w:sz="0" w:val="nil"/>
+          <w:right w:space="0" w:sz="0" w:val="nil"/>
+          <w:between w:space="0" w:sz="0" w:val="nil"/>
+        </w:pBdr>
+        <w:shd w:fill="auto" w:val="clear"/>
+        <w:spacing w:after="20" w:before="0" w:line="240" w:lineRule="auto"/>
+        <w:ind w:left="360" w:right="0" w:hanging="360"/>
+        <w:jc w:val="both"/>
+        <w:rPr/>
+      </w:pPr>
+      <w:r>
+        <w:rPr>
+          <w:rFonts w:ascii="Arial" w:cs="Arial" w:eastAsia="Arial" w:hAnsi="Arial"/>
+          <w:i w:val="0"/>
+          <w:iCs w:val="0"/>
+          <w:smallCaps w:val="0"/>
+          <w:strike w:val="0"/>
+          <w:color w:val="000000"/>
+          <w:sz w:val="17"/>
+          <w:szCs w:val="17"/>
+          <w:u w:val="none"/>
+          <w:shd w:fill="auto" w:val="clear"/>
+          <w:vertAlign w:val="baseline"/>
+          <w:rtl w:val="0"/>
+        </w:rPr>
+        <w:t xml:space="preserve">IA: chatbot FAQ con Gemini API gratuita, sin acceso irrestricto a BD ni envío de datos sensibles.</w:t>
+      </w:r>
+      <w:r>
+        <w:rPr>
+          <w:rtl w:val="0"/>
+        </w:rPr>
+      </w:r>
+    </w:p>
+    <w:p>
+      <w:pPr>
+        <w:spacing w:after="40" w:before="100" w:lineRule="auto"/>
+        <w:jc w:val="both"/>
+        <w:rPr>
+          <w:rFonts w:ascii="Arial" w:cs="Arial" w:eastAsia="Arial" w:hAnsi="Arial"/>
+          <w:b w:val="1"/>
+          <w:bCs w:val="1"/>
+          <w:color w:val="1f4e78"/>
+          <w:sz w:val="22"/>
+          <w:szCs w:val="22"/>
+        </w:rPr>
+      </w:pPr>
+      <w:r>
+        <w:rPr>
+          <w:rtl w:val="0"/>
+        </w:rPr>
+      </w:r>
+    </w:p>
+    <w:p>
+      <w:pPr>
+        <w:spacing w:after="40" w:before="100" w:lineRule="auto"/>
+        <w:jc w:val="both"/>
+        <w:rPr>
+          <w:rFonts w:ascii="Arial" w:cs="Arial" w:eastAsia="Arial" w:hAnsi="Arial"/>
+          <w:b w:val="1"/>
+          <w:bCs w:val="1"/>
+          <w:color w:val="1f4e78"/>
+          <w:sz w:val="22"/>
+          <w:szCs w:val="22"/>
+        </w:rPr>
+      </w:pPr>
+      <w:r>
+        <w:rPr>
+          <w:rtl w:val="0"/>
+        </w:rPr>
+      </w:r>
+    </w:p>
+    <w:p>
+      <w:pPr>
+        <w:spacing w:after="40" w:before="100" w:lineRule="auto"/>
+        <w:jc w:val="both"/>
         <w:rPr>
           <w:rFonts w:ascii="Arial" w:cs="Arial" w:eastAsia="Arial" w:hAnsi="Arial"/>
         </w:rPr>
+      </w:pPr>
+      <w:r>
+        <w:rPr>
+          <w:rFonts w:ascii="Arial" w:cs="Arial" w:eastAsia="Arial" w:hAnsi="Arial"/>
+          <w:b w:val="1"/>
+          <w:bCs w:val="1"/>
+          <w:color w:val="1f4e78"/>
+          <w:sz w:val="22"/>
+          <w:szCs w:val="22"/>
+          <w:rtl w:val="0"/>
+        </w:rPr>
+        <w:t xml:space="preserve">5. Fuera del alcance del proyecto</w:t>
+      </w:r>
+      <w:r>
+        <w:rPr>
+          <w:rtl w:val="0"/>
+        </w:rPr>
+      </w:r>
+    </w:p>
+    <w:p>
+      <w:pPr>
+        <w:keepNext w:val="0"/>
+        <w:keepLines w:val="0"/>
+        <w:pageBreakBefore w:val="0"/>
+        <w:widowControl w:val="1"/>
+        <w:numPr>
+          <w:ilvl w:val="0"/>
+          <w:numId w:val="1"/>
+        </w:numPr>
+        <w:pBdr>
+          <w:top w:space="0" w:sz="0" w:val="nil"/>
+          <w:left w:space="0" w:sz="0" w:val="nil"/>
+          <w:bottom w:space="0" w:sz="0" w:val="nil"/>
+          <w:right w:space="0" w:sz="0" w:val="nil"/>
+          <w:between w:space="0" w:sz="0" w:val="nil"/>
+        </w:pBdr>
+        <w:shd w:fill="auto" w:val="clear"/>
+        <w:spacing w:after="0" w:before="0" w:line="240" w:lineRule="auto"/>
+        <w:ind w:left="360" w:right="0" w:hanging="360"/>
+        <w:jc w:val="both"/>
+        <w:rPr/>
       </w:pPr>
       <w:r>
         <w:rPr>
@@ -1872,6 +1931,11 @@
         </w:rPr>
         <w:t xml:space="preserve">Aplicación móvil nativa y votaciones electrónicas.</w:t>
       </w:r>
+      <w:r>
+        <w:rPr>
+          <w:rtl w:val="0"/>
+        </w:rPr>
+      </w:r>
     </w:p>
     <w:p>
       <w:pPr>
@@ -1893,10 +1957,8 @@
         <w:shd w:fill="auto" w:val="clear"/>
         <w:spacing w:after="0" w:before="0" w:line="240" w:lineRule="auto"/>
         <w:ind w:left="360" w:right="0" w:hanging="360"/>
-        <w:jc w:val="left"/>
-        <w:rPr>
-          <w:rFonts w:ascii="Arial" w:cs="Arial" w:eastAsia="Arial" w:hAnsi="Arial"/>
-        </w:rPr>
+        <w:jc w:val="both"/>
+        <w:rPr/>
       </w:pPr>
       <w:r>
         <w:rPr>
@@ -1915,6 +1977,11 @@
         </w:rPr>
         <w:t xml:space="preserve">Certificados formales y firma electrónica avanzada.</w:t>
       </w:r>
+      <w:r>
+        <w:rPr>
+          <w:rtl w:val="0"/>
+        </w:rPr>
+      </w:r>
     </w:p>
     <w:p>
       <w:pPr>
@@ -1936,10 +2003,8 @@
         <w:shd w:fill="auto" w:val="clear"/>
         <w:spacing w:after="0" w:before="0" w:line="240" w:lineRule="auto"/>
         <w:ind w:left="360" w:right="0" w:hanging="360"/>
-        <w:jc w:val="left"/>
-        <w:rPr>
-          <w:rFonts w:ascii="Arial" w:cs="Arial" w:eastAsia="Arial" w:hAnsi="Arial"/>
-        </w:rPr>
+        <w:jc w:val="both"/>
+        <w:rPr/>
       </w:pPr>
       <w:r>
         <w:rPr>
@@ -1958,6 +2023,11 @@
         </w:rPr>
         <w:t xml:space="preserve">Integración directa con sistemas municipales externos.</w:t>
       </w:r>
+      <w:r>
+        <w:rPr>
+          <w:rtl w:val="0"/>
+        </w:rPr>
+      </w:r>
     </w:p>
     <w:p>
       <w:pPr>
@@ -1979,10 +2049,8 @@
         <w:shd w:fill="auto" w:val="clear"/>
         <w:spacing w:after="0" w:before="0" w:line="240" w:lineRule="auto"/>
         <w:ind w:left="360" w:right="0" w:hanging="360"/>
-        <w:jc w:val="left"/>
-        <w:rPr>
-          <w:rFonts w:ascii="Arial" w:cs="Arial" w:eastAsia="Arial" w:hAnsi="Arial"/>
-        </w:rPr>
+        <w:jc w:val="both"/>
+        <w:rPr/>
       </w:pPr>
       <w:r>
         <w:rPr>
@@ -2001,6 +2069,11 @@
         </w:rPr>
         <w:t xml:space="preserve">Georreferenciación avanzada o mapas de propiedades.</w:t>
       </w:r>
+      <w:r>
+        <w:rPr>
+          <w:rtl w:val="0"/>
+        </w:rPr>
+      </w:r>
     </w:p>
     <w:p>
       <w:pPr>
@@ -2022,10 +2095,8 @@
         <w:shd w:fill="auto" w:val="clear"/>
         <w:spacing w:after="20" w:before="0" w:line="240" w:lineRule="auto"/>
         <w:ind w:left="360" w:right="0" w:hanging="360"/>
-        <w:jc w:val="left"/>
-        <w:rPr>
-          <w:rFonts w:ascii="Arial" w:cs="Arial" w:eastAsia="Arial" w:hAnsi="Arial"/>
-        </w:rPr>
+        <w:jc w:val="both"/>
+        <w:rPr/>
       </w:pPr>
       <w:r>
         <w:rPr>
@@ -2044,10 +2115,16 @@
         </w:rPr>
         <w:t xml:space="preserve">IA con acceso directo e irrestricto a datos personales o a toda la base de datos.</w:t>
       </w:r>
+      <w:r>
+        <w:rPr>
+          <w:rtl w:val="0"/>
+        </w:rPr>
+      </w:r>
     </w:p>
     <w:p>
       <w:pPr>
         <w:spacing w:after="40" w:before="100" w:lineRule="auto"/>
+        <w:jc w:val="both"/>
         <w:rPr>
           <w:rFonts w:ascii="Arial" w:cs="Arial" w:eastAsia="Arial" w:hAnsi="Arial"/>
         </w:rPr>
@@ -2090,10 +2167,8 @@
         <w:shd w:fill="auto" w:val="clear"/>
         <w:spacing w:after="0" w:before="0" w:line="240" w:lineRule="auto"/>
         <w:ind w:left="360" w:right="0" w:hanging="360"/>
-        <w:jc w:val="left"/>
-        <w:rPr>
-          <w:rFonts w:ascii="Arial" w:cs="Arial" w:eastAsia="Arial" w:hAnsi="Arial"/>
-        </w:rPr>
+        <w:jc w:val="both"/>
+        <w:rPr/>
       </w:pPr>
       <w:r>
         <w:rPr>
@@ -2110,7 +2185,12 @@
           <w:vertAlign w:val="baseline"/>
           <w:rtl w:val="0"/>
         </w:rPr>
-        <w:t xml:space="preserve">Entregar un MVP funcional que cubra los procesos comunitarios definidos y mantenga trazabilidad de solicitudes.</w:t>
+        <w:t xml:space="preserve">Entregar una solución funcional que cubra los procesos comunitarios definidos y mantenga trazabilidad de solicitudes.</w:t>
+      </w:r>
+      <w:r>
+        <w:rPr>
+          <w:rtl w:val="0"/>
+        </w:rPr>
       </w:r>
     </w:p>
     <w:p>
@@ -2133,10 +2213,8 @@
         <w:shd w:fill="auto" w:val="clear"/>
         <w:spacing w:after="0" w:before="0" w:line="240" w:lineRule="auto"/>
         <w:ind w:left="360" w:right="0" w:hanging="360"/>
-        <w:jc w:val="left"/>
-        <w:rPr>
-          <w:rFonts w:ascii="Arial" w:cs="Arial" w:eastAsia="Arial" w:hAnsi="Arial"/>
-        </w:rPr>
+        <w:jc w:val="both"/>
+        <w:rPr/>
       </w:pPr>
       <w:r>
         <w:rPr>
@@ -2155,6 +2233,11 @@
         </w:rPr>
         <w:t xml:space="preserve">Aplicar control de acceso por rol y resguardar la privacidad de los datos personales.</w:t>
       </w:r>
+      <w:r>
+        <w:rPr>
+          <w:rtl w:val="0"/>
+        </w:rPr>
+      </w:r>
     </w:p>
     <w:p>
       <w:pPr>
@@ -2176,10 +2259,8 @@
         <w:shd w:fill="auto" w:val="clear"/>
         <w:spacing w:after="0" w:before="0" w:line="240" w:lineRule="auto"/>
         <w:ind w:left="360" w:right="0" w:hanging="360"/>
-        <w:jc w:val="left"/>
-        <w:rPr>
-          <w:rFonts w:ascii="Arial" w:cs="Arial" w:eastAsia="Arial" w:hAnsi="Arial"/>
-        </w:rPr>
+        <w:jc w:val="both"/>
+        <w:rPr/>
       </w:pPr>
       <w:r>
         <w:rPr>
@@ -2198,6 +2279,11 @@
         </w:rPr>
         <w:t xml:space="preserve">Generar indicadores y dashboards agregados útiles para Directiva y Municipalidad.</w:t>
       </w:r>
+      <w:r>
+        <w:rPr>
+          <w:rtl w:val="0"/>
+        </w:rPr>
+      </w:r>
     </w:p>
     <w:p>
       <w:pPr>
@@ -2219,10 +2305,8 @@
         <w:shd w:fill="auto" w:val="clear"/>
         <w:spacing w:after="0" w:before="0" w:line="240" w:lineRule="auto"/>
         <w:ind w:left="360" w:right="0" w:hanging="360"/>
-        <w:jc w:val="left"/>
-        <w:rPr>
-          <w:rFonts w:ascii="Arial" w:cs="Arial" w:eastAsia="Arial" w:hAnsi="Arial"/>
-        </w:rPr>
+        <w:jc w:val="both"/>
+        <w:rPr/>
       </w:pPr>
       <w:r>
         <w:rPr>
@@ -2241,6 +2325,11 @@
         </w:rPr>
         <w:t xml:space="preserve">Integrar un chatbot FAQ útil, seguro y capaz de derivar al canal humano cuando corresponda.</w:t>
       </w:r>
+      <w:r>
+        <w:rPr>
+          <w:rtl w:val="0"/>
+        </w:rPr>
+      </w:r>
     </w:p>
     <w:p>
       <w:pPr>
@@ -2262,10 +2351,8 @@
         <w:shd w:fill="auto" w:val="clear"/>
         <w:spacing w:after="20" w:before="0" w:line="240" w:lineRule="auto"/>
         <w:ind w:left="360" w:right="0" w:hanging="360"/>
-        <w:jc w:val="left"/>
-        <w:rPr>
-          <w:rFonts w:ascii="Arial" w:cs="Arial" w:eastAsia="Arial" w:hAnsi="Arial"/>
-        </w:rPr>
+        <w:jc w:val="both"/>
+        <w:rPr/>
       </w:pPr>
       <w:r>
         <w:rPr>
@@ -2284,10 +2371,16 @@
         </w:rPr>
         <w:t xml:space="preserve">Contar con una demostración integrada y evidencias técnicas suficientes para la evaluación académica.</w:t>
       </w:r>
+      <w:r>
+        <w:rPr>
+          <w:rtl w:val="0"/>
+        </w:rPr>
+      </w:r>
     </w:p>
     <w:p>
       <w:pPr>
         <w:spacing w:after="40" w:before="100" w:lineRule="auto"/>
+        <w:jc w:val="both"/>
         <w:rPr>
           <w:rFonts w:ascii="Arial" w:cs="Arial" w:eastAsia="Arial" w:hAnsi="Arial"/>
         </w:rPr>
@@ -2330,10 +2423,8 @@
         <w:shd w:fill="auto" w:val="clear"/>
         <w:spacing w:after="0" w:before="0" w:line="240" w:lineRule="auto"/>
         <w:ind w:left="360" w:right="0" w:hanging="360"/>
-        <w:jc w:val="left"/>
-        <w:rPr>
-          <w:rFonts w:ascii="Arial" w:cs="Arial" w:eastAsia="Arial" w:hAnsi="Arial"/>
-        </w:rPr>
+        <w:jc w:val="both"/>
+        <w:rPr/>
       </w:pPr>
       <w:r>
         <w:rPr>
@@ -2350,7 +2441,12 @@
           <w:vertAlign w:val="baseline"/>
           <w:rtl w:val="0"/>
         </w:rPr>
-        <w:t xml:space="preserve">Tecnologías gratuitas o de libre acceso para el desarrollo académico.</w:t>
+        <w:t xml:space="preserve">Tecnologías gratuitas, de código abierto o con planes de acceso adecuados para el desarrollo del proyecto.</w:t>
+      </w:r>
+      <w:r>
+        <w:rPr>
+          <w:rtl w:val="0"/>
+        </w:rPr>
       </w:r>
     </w:p>
     <w:p>
@@ -2373,10 +2469,8 @@
         <w:shd w:fill="auto" w:val="clear"/>
         <w:spacing w:after="0" w:before="0" w:line="240" w:lineRule="auto"/>
         <w:ind w:left="360" w:right="0" w:hanging="360"/>
-        <w:jc w:val="left"/>
-        <w:rPr>
-          <w:rFonts w:ascii="Arial" w:cs="Arial" w:eastAsia="Arial" w:hAnsi="Arial"/>
-        </w:rPr>
+        <w:jc w:val="both"/>
+        <w:rPr/>
       </w:pPr>
       <w:r>
         <w:rPr>
@@ -2395,6 +2489,11 @@
         </w:rPr>
         <w:t xml:space="preserve">Frontend: React, Vite, TypeScript, TailwindCSS y DaisyUI; Backend: Python, Django y Django REST Framework.</w:t>
       </w:r>
+      <w:r>
+        <w:rPr>
+          <w:rtl w:val="0"/>
+        </w:rPr>
+      </w:r>
     </w:p>
     <w:p>
       <w:pPr>
@@ -2416,10 +2515,8 @@
         <w:shd w:fill="auto" w:val="clear"/>
         <w:spacing w:after="0" w:before="0" w:line="240" w:lineRule="auto"/>
         <w:ind w:left="360" w:right="0" w:hanging="360"/>
-        <w:jc w:val="left"/>
-        <w:rPr>
-          <w:rFonts w:ascii="Arial" w:cs="Arial" w:eastAsia="Arial" w:hAnsi="Arial"/>
-        </w:rPr>
+        <w:jc w:val="both"/>
+        <w:rPr/>
       </w:pPr>
       <w:r>
         <w:rPr>
@@ -2436,7 +2533,12 @@
           <w:vertAlign w:val="baseline"/>
           <w:rtl w:val="0"/>
         </w:rPr>
-        <w:t xml:space="preserve">Base de datos MySQL y almacenamiento local de archivos para la demostración.</w:t>
+        <w:t xml:space="preserve">Base de datos MySQL y almacenamiento de archivos gestionado por la aplicación, con posibilidad de escalar a almacenamiento externo según necesidad.</w:t>
+      </w:r>
+      <w:r>
+        <w:rPr>
+          <w:rtl w:val="0"/>
+        </w:rPr>
       </w:r>
     </w:p>
     <w:p>
@@ -2459,10 +2561,8 @@
         <w:shd w:fill="auto" w:val="clear"/>
         <w:spacing w:after="0" w:before="0" w:line="240" w:lineRule="auto"/>
         <w:ind w:left="360" w:right="0" w:hanging="360"/>
-        <w:jc w:val="left"/>
-        <w:rPr>
-          <w:rFonts w:ascii="Arial" w:cs="Arial" w:eastAsia="Arial" w:hAnsi="Arial"/>
-        </w:rPr>
+        <w:jc w:val="both"/>
+        <w:rPr/>
       </w:pPr>
       <w:r>
         <w:rPr>
@@ -2479,7 +2579,12 @@
           <w:vertAlign w:val="baseline"/>
           <w:rtl w:val="0"/>
         </w:rPr>
-        <w:t xml:space="preserve">Ejecución local durante el desarrollo; despliegue web sujeto al tiempo disponible.</w:t>
+        <w:t xml:space="preserve">Ejecución local y contenedorizada durante el desarrollo, con arquitectura preparada para despliegue web productivo y escalamiento futuro.</w:t>
+      </w:r>
+      <w:r>
+        <w:rPr>
+          <w:rtl w:val="0"/>
+        </w:rPr>
       </w:r>
     </w:p>
     <w:p>
@@ -2502,10 +2607,8 @@
         <w:shd w:fill="auto" w:val="clear"/>
         <w:spacing w:after="20" w:before="0" w:line="240" w:lineRule="auto"/>
         <w:ind w:left="360" w:right="0" w:hanging="360"/>
-        <w:jc w:val="left"/>
-        <w:rPr>
-          <w:rFonts w:ascii="Arial" w:cs="Arial" w:eastAsia="Arial" w:hAnsi="Arial"/>
-        </w:rPr>
+        <w:jc w:val="both"/>
+        <w:rPr/>
       </w:pPr>
       <w:r>
         <w:rPr>
@@ -2524,10 +2627,16 @@
         </w:rPr>
         <w:t xml:space="preserve">Interfaz responsive, consistente y legible, considerando especialmente a usuarios de mayor edad.</w:t>
       </w:r>
+      <w:r>
+        <w:rPr>
+          <w:rtl w:val="0"/>
+        </w:rPr>
+      </w:r>
     </w:p>
     <w:p>
       <w:pPr>
         <w:spacing w:after="40" w:before="100" w:lineRule="auto"/>
+        <w:jc w:val="both"/>
         <w:rPr>
           <w:rFonts w:ascii="Arial" w:cs="Arial" w:eastAsia="Arial" w:hAnsi="Arial"/>
         </w:rPr>
@@ -2581,7 +2690,7 @@
           </w:tcPr>
           <w:p>
             <w:pPr>
-              <w:jc w:val="center"/>
+              <w:jc w:val="both"/>
               <w:rPr>
                 <w:rFonts w:ascii="Arial" w:cs="Arial" w:eastAsia="Arial" w:hAnsi="Arial"/>
               </w:rPr>
@@ -2611,7 +2720,7 @@
           </w:tcPr>
           <w:p>
             <w:pPr>
-              <w:jc w:val="center"/>
+              <w:jc w:val="both"/>
               <w:rPr>
                 <w:rFonts w:ascii="Arial" w:cs="Arial" w:eastAsia="Arial" w:hAnsi="Arial"/>
               </w:rPr>
@@ -2641,7 +2750,7 @@
           </w:tcPr>
           <w:p>
             <w:pPr>
-              <w:jc w:val="center"/>
+              <w:jc w:val="both"/>
               <w:rPr>
                 <w:rFonts w:ascii="Arial" w:cs="Arial" w:eastAsia="Arial" w:hAnsi="Arial"/>
               </w:rPr>
@@ -2687,6 +2796,7 @@
           </w:tcPr>
           <w:p>
             <w:pPr>
+              <w:jc w:val="both"/>
               <w:rPr>
                 <w:rFonts w:ascii="Arial" w:cs="Arial" w:eastAsia="Arial" w:hAnsi="Arial"/>
               </w:rPr>
@@ -2723,6 +2833,7 @@
           </w:tcPr>
           <w:p>
             <w:pPr>
+              <w:jc w:val="both"/>
               <w:rPr>
                 <w:rFonts w:ascii="Arial" w:cs="Arial" w:eastAsia="Arial" w:hAnsi="Arial"/>
               </w:rPr>
@@ -2759,6 +2870,7 @@
           </w:tcPr>
           <w:p>
             <w:pPr>
+              <w:jc w:val="both"/>
               <w:rPr>
                 <w:rFonts w:ascii="Arial" w:cs="Arial" w:eastAsia="Arial" w:hAnsi="Arial"/>
               </w:rPr>
@@ -2801,6 +2913,7 @@
           </w:tcPr>
           <w:p>
             <w:pPr>
+              <w:jc w:val="both"/>
               <w:rPr>
                 <w:rFonts w:ascii="Arial" w:cs="Arial" w:eastAsia="Arial" w:hAnsi="Arial"/>
               </w:rPr>
@@ -2837,6 +2950,7 @@
           </w:tcPr>
           <w:p>
             <w:pPr>
+              <w:jc w:val="both"/>
               <w:rPr>
                 <w:rFonts w:ascii="Arial" w:cs="Arial" w:eastAsia="Arial" w:hAnsi="Arial"/>
               </w:rPr>
@@ -2873,6 +2987,7 @@
           </w:tcPr>
           <w:p>
             <w:pPr>
+              <w:jc w:val="both"/>
               <w:rPr>
                 <w:rFonts w:ascii="Arial" w:cs="Arial" w:eastAsia="Arial" w:hAnsi="Arial"/>
               </w:rPr>
@@ -2915,6 +3030,7 @@
           </w:tcPr>
           <w:p>
             <w:pPr>
+              <w:jc w:val="both"/>
               <w:rPr>
                 <w:rFonts w:ascii="Arial" w:cs="Arial" w:eastAsia="Arial" w:hAnsi="Arial"/>
               </w:rPr>
@@ -2951,6 +3067,7 @@
           </w:tcPr>
           <w:p>
             <w:pPr>
+              <w:jc w:val="both"/>
               <w:rPr>
                 <w:rFonts w:ascii="Arial" w:cs="Arial" w:eastAsia="Arial" w:hAnsi="Arial"/>
               </w:rPr>
@@ -2987,6 +3104,7 @@
           </w:tcPr>
           <w:p>
             <w:pPr>
+              <w:jc w:val="both"/>
               <w:rPr>
                 <w:rFonts w:ascii="Arial" w:cs="Arial" w:eastAsia="Arial" w:hAnsi="Arial"/>
               </w:rPr>
@@ -3029,6 +3147,7 @@
           </w:tcPr>
           <w:p>
             <w:pPr>
+              <w:jc w:val="both"/>
               <w:rPr>
                 <w:rFonts w:ascii="Arial" w:cs="Arial" w:eastAsia="Arial" w:hAnsi="Arial"/>
               </w:rPr>
@@ -3065,6 +3184,7 @@
           </w:tcPr>
           <w:p>
             <w:pPr>
+              <w:jc w:val="both"/>
               <w:rPr>
                 <w:rFonts w:ascii="Arial" w:cs="Arial" w:eastAsia="Arial" w:hAnsi="Arial"/>
               </w:rPr>
@@ -3101,6 +3221,7 @@
           </w:tcPr>
           <w:p>
             <w:pPr>
+              <w:jc w:val="both"/>
               <w:rPr>
                 <w:rFonts w:ascii="Arial" w:cs="Arial" w:eastAsia="Arial" w:hAnsi="Arial"/>
               </w:rPr>
@@ -3143,6 +3264,7 @@
           </w:tcPr>
           <w:p>
             <w:pPr>
+              <w:jc w:val="both"/>
               <w:rPr>
                 <w:rFonts w:ascii="Arial" w:cs="Arial" w:eastAsia="Arial" w:hAnsi="Arial"/>
               </w:rPr>
@@ -3179,6 +3301,7 @@
           </w:tcPr>
           <w:p>
             <w:pPr>
+              <w:jc w:val="both"/>
               <w:rPr>
                 <w:rFonts w:ascii="Arial" w:cs="Arial" w:eastAsia="Arial" w:hAnsi="Arial"/>
               </w:rPr>
@@ -3215,6 +3338,7 @@
           </w:tcPr>
           <w:p>
             <w:pPr>
+              <w:jc w:val="both"/>
               <w:rPr>
                 <w:rFonts w:ascii="Arial" w:cs="Arial" w:eastAsia="Arial" w:hAnsi="Arial"/>
               </w:rPr>
@@ -3240,6 +3364,7 @@
     <w:p>
       <w:pPr>
         <w:spacing w:after="40" w:before="100" w:lineRule="auto"/>
+        <w:jc w:val="both"/>
         <w:rPr>
           <w:rFonts w:ascii="Arial" w:cs="Arial" w:eastAsia="Arial" w:hAnsi="Arial"/>
         </w:rPr>
@@ -3265,6 +3390,7 @@
     <w:p>
       <w:pPr>
         <w:spacing w:after="0" w:line="252.00000000000003" w:lineRule="auto"/>
+        <w:jc w:val="both"/>
         <w:rPr>
           <w:rFonts w:ascii="Arial" w:cs="Arial" w:eastAsia="Arial" w:hAnsi="Arial"/>
         </w:rPr>
@@ -3329,6 +3455,7 @@
     <w:p>
       <w:pPr>
         <w:spacing w:after="0" w:before="160" w:lineRule="auto"/>
+        <w:jc w:val="both"/>
         <w:rPr>
           <w:rFonts w:ascii="Arial" w:cs="Arial" w:eastAsia="Arial" w:hAnsi="Arial"/>
         </w:rPr>
@@ -3341,7 +3468,7 @@
           <w:szCs w:val="15"/>
           <w:rtl w:val="0"/>
         </w:rPr>
-        <w:t xml:space="preserve">Base documental: Definición del Proyecto APT, planilla de requerimientos, Historias de Usuario, ERS, Casos de Uso, Product Backlog, Sprint Backlog y Carta Gantt.</w:t>
+        <w:t xml:space="preserve">Base documental: Definición del Proyecto APT, Historias de Usuario, ERS, Casos de Uso, Product Backlog, Sprint Backlog, Definition of Done, Roadmap y documentación técnica del proyecto.</w:t>
       </w:r>
       <w:r>
         <w:rPr>
@@ -3366,7 +3493,6 @@
     <w:pPr>
       <w:keepNext w:val="0"/>
       <w:keepLines w:val="0"/>
-      <w:pageBreakBefore w:val="0"/>
       <w:widowControl w:val="1"/>
       <w:pBdr>
         <w:top w:space="0" w:sz="0" w:val="nil"/>
@@ -3470,7 +3596,6 @@
     <w:pPr>
       <w:keepNext w:val="0"/>
       <w:keepLines w:val="0"/>
-      <w:pageBreakBefore w:val="0"/>
       <w:widowControl w:val="1"/>
       <w:pBdr>
         <w:top w:space="0" w:sz="0" w:val="nil"/>
@@ -3781,6 +3906,20 @@
       <w:szCs w:val="52"/>
     </w:rPr>
   </w:style>
+  <w:style w:type="table" w:styleId="TableNormal" w:default="1">
+    <w:name w:val="TableNormal"/>
+    <w:tblPr>
+      <w:tblCellMar>
+        <w:top w:w="100.0" w:type="dxa"/>
+        <w:left w:w="100.0" w:type="dxa"/>
+        <w:bottom w:w="100.0" w:type="dxa"/>
+        <w:right w:w="100.0" w:type="dxa"/>
+      </w:tblCellMar>
+    </w:tblPr>
+  </w:style>
+  <w:style w:type="paragraph" w:styleId="Normal" w:default="1">
+    <w:name w:val="normal"/>
+  </w:style>
   <w:style w:type="paragraph" w:styleId="Header">
     <w:name w:val="header"/>
     <w:basedOn w:val="Normal"/>
@@ -15277,6 +15416,58 @@
         <w:shd w:color="auto" w:fill="fbcaa2" w:themeFill="accent6" w:themeFillTint="00007F" w:val="clear"/>
       </w:tcPr>
     </w:tblStylePr>
+  </w:style>
+  <w:style w:type="table" w:styleId="Table1">
+    <w:basedOn w:val="TableNormal"/>
+    <w:tblPr>
+      <w:tblStyleRowBandSize w:val="1"/>
+      <w:tblStyleColBandSize w:val="1"/>
+      <w:tblCellMar>
+        <w:top w:w="0.0" w:type="dxa"/>
+        <w:left w:w="115.0" w:type="dxa"/>
+        <w:bottom w:w="0.0" w:type="dxa"/>
+        <w:right w:w="115.0" w:type="dxa"/>
+      </w:tblCellMar>
+    </w:tblPr>
+  </w:style>
+  <w:style w:type="table" w:styleId="Table2">
+    <w:basedOn w:val="TableNormal"/>
+    <w:tblPr>
+      <w:tblStyleRowBandSize w:val="1"/>
+      <w:tblStyleColBandSize w:val="1"/>
+      <w:tblCellMar>
+        <w:top w:w="0.0" w:type="dxa"/>
+        <w:left w:w="115.0" w:type="dxa"/>
+        <w:bottom w:w="0.0" w:type="dxa"/>
+        <w:right w:w="115.0" w:type="dxa"/>
+      </w:tblCellMar>
+    </w:tblPr>
+  </w:style>
+  <w:style w:type="table" w:styleId="Table3">
+    <w:basedOn w:val="TableNormal"/>
+    <w:tblPr>
+      <w:tblStyleRowBandSize w:val="1"/>
+      <w:tblStyleColBandSize w:val="1"/>
+      <w:tblCellMar>
+        <w:top w:w="0.0" w:type="dxa"/>
+        <w:left w:w="115.0" w:type="dxa"/>
+        <w:bottom w:w="0.0" w:type="dxa"/>
+        <w:right w:w="115.0" w:type="dxa"/>
+      </w:tblCellMar>
+    </w:tblPr>
+  </w:style>
+  <w:style w:type="table" w:styleId="Table4">
+    <w:basedOn w:val="TableNormal"/>
+    <w:tblPr>
+      <w:tblStyleRowBandSize w:val="1"/>
+      <w:tblStyleColBandSize w:val="1"/>
+      <w:tblCellMar>
+        <w:top w:w="0.0" w:type="dxa"/>
+        <w:left w:w="115.0" w:type="dxa"/>
+        <w:bottom w:w="0.0" w:type="dxa"/>
+        <w:right w:w="115.0" w:type="dxa"/>
+      </w:tblCellMar>
+    </w:tblPr>
   </w:style>
   <w:style w:type="paragraph" w:styleId="Subtitle">
     <w:name w:val="Subtitle"/>
@@ -15669,7 +15860,7 @@
 
 <file path=customXML/item1.xml><?xml version="1.0" encoding="utf-8"?>
 <go:gDocsCustomXmlDataStorage xmlns:go="http://customooxmlschemas.google.com/" xmlns:r="http://schemas.openxmlformats.org/officeDocument/2006/relationships" uri="GoogleDocsCustomDataVersion2">
-  <go:docsCustomData xmlns:go="http://customooxmlschemas.google.com/" roundtripDataSignature="AMtx7mieCHJJB4tOeemjLHDs4BGqX7pOYg==">CgMxLjA4AHIhMXhxOC1haE1QdmNjR3RMcWU3WUxySW5OV0w1dmxZaUxC</go:docsCustomData>
+  <go:docsCustomData xmlns:go="http://customooxmlschemas.google.com/" roundtripDataSignature="AMtx7mg8ej+jTshiNlO+FHVBfra56UF62w==">CgMxLjA4AHIhMVQ4dU1EWENOSkZXX1VxbnRCS3c4Yi1iNUV2ZGFuSmJM</go:docsCustomData>
 </go:gDocsCustomXmlDataStorage>
 </file>
 

</xml_diff>